<commit_message>
Keep visual example captions separated and polish report formatting
</commit_message>
<xml_diff>
--- a/hw3/高效率BERT古文断句标点微调与批量长文推理实验.docx
+++ b/hw3/高效率BERT古文断句标点微调与批量长文推理实验.docx
@@ -9534,7 +9534,18 @@
         <w:rPr>
           <w:b w:val="0"/>
         </w:rPr>
-        <w:t xml:space="preserve">**两个源字符的核查。**人民日报原始段落 </w:t>
+      </w:r>
+      <w:r>
+        <w:rPr>
+          <w:b/>
+        </w:rPr>
+        <w:t>两个源字符的核查。</w:t>
+      </w:r>
+      <w:r>
+        <w:rPr>
+          <w:b w:val="0"/>
+        </w:rPr>
+        <w:t xml:space="preserve"> 人民日报原始段落 </w:t>
       </w:r>
       <w:r>
         <w:rPr>
@@ -9898,6 +9909,18 @@
             </a:graphic>
           </wp:inline>
         </w:drawing>
+      </w:r>
+    </w:p>
+    <w:p>
+      <w:pPr>
+        <w:pStyle w:val="Caption"/>
+        <w:jc w:val="center"/>
+      </w:pPr>
+      <w:r>
+        <w:rPr>
+          <w:b w:val="0"/>
+        </w:rPr>
+        <w:t>图 16　现代文最长样例的实际预测。</w:t>
       </w:r>
     </w:p>
     <w:p>

</xml_diff>